<commit_message>
refactor(report): clarify evidence synthesis scope
</commit_message>
<xml_diff>
--- a/templates/clinical_variant_report_v1.docx
+++ b/templates/clinical_variant_report_v1.docx
@@ -256,7 +256,7 @@
         <w:pStyle w:val="MajorHeading"/>
       </w:pPr>
       <w:r>
-        <w:t>Conclusive Result(s):</w:t>
+        <w:t>Variant and source classification context:</w:t>
       </w:r>
     </w:p>
     <w:tbl>
@@ -266,8 +266,8 @@
         <w:tblLayout w:type="fixed"/>
         <w:tblLook w:firstColumn="1" w:firstRow="1" w:lastColumn="0" w:lastRow="0" w:noHBand="0" w:noVBand="1" w:val="04A0"/>
         <w:tblInd w:w="200" w:type="dxa"/>
-        <w:tblCaption w:val="Conclusive result for one accepted allele"/>
-        <w:tblDescription w:val="Conclusive result for one accepted allele"/>
+        <w:tblCaption w:val="Variant and source classification context for one accepted allele"/>
+        <w:tblDescription w:val="Variant and source classification context for one accepted allele"/>
         <w:tblBorders>
           <w:top w:val="single" w:sz="16" w:space="0" w:color="C00000"/>
           <w:left w:val="single" w:sz="16" w:space="0" w:color="C00000"/>

</xml_diff>

<commit_message>
Revert "fix(input): gate interpretation on call quality"
This reverts commit c54bd5c85d311a132a6e8abfdebc1cc08c2c1164.
</commit_message>
<xml_diff>
--- a/templates/clinical_variant_report_v1.docx
+++ b/templates/clinical_variant_report_v1.docx
@@ -256,7 +256,7 @@
         <w:pStyle w:val="MajorHeading"/>
       </w:pPr>
       <w:r>
-        <w:t>Variant and source classification context:</w:t>
+        <w:t>Conclusive Result(s):</w:t>
       </w:r>
     </w:p>
     <w:tbl>
@@ -266,8 +266,8 @@
         <w:tblLayout w:type="fixed"/>
         <w:tblLook w:firstColumn="1" w:firstRow="1" w:lastColumn="0" w:lastRow="0" w:noHBand="0" w:noVBand="1" w:val="04A0"/>
         <w:tblInd w:w="200" w:type="dxa"/>
-        <w:tblCaption w:val="Variant and source classification context for one accepted allele"/>
-        <w:tblDescription w:val="Variant and source classification context for one accepted allele"/>
+        <w:tblCaption w:val="Conclusive result for one accepted allele"/>
+        <w:tblDescription w:val="Conclusive result for one accepted allele"/>
         <w:tblBorders>
           <w:top w:val="single" w:sz="16" w:space="0" w:color="C00000"/>
           <w:left w:val="single" w:sz="16" w:space="0" w:color="C00000"/>
@@ -314,7 +314,7 @@
               <w:pStyle w:val="ResultClassification"/>
             </w:pPr>
             <w:r>
-              <w:t>System classification: {{CLASSIFICATION}}</w:t>
+              <w:t>{{CLASSIFICATION}}</w:t>
             </w:r>
           </w:p>
           <w:p>

</xml_diff>